<commit_message>
Day26-Evaluator: guard judge JSON parse against malformed output, add project.md
EvaluateAsync's null-coalescing fallback only covered a successful
deserialization that returned null - a malformed/truncated judge
response threw an uncaught JsonException and crashed the whole
evaluation suite instead of just failing that one test case. Adds a
try/catch that degrades to the same safe failure result. Syncs the
docx's Complete Code listing and Code Walkthrough prose, and replaces
missing.md with project.md.
</commit_message>
<xml_diff>
--- a/Day26-Evaluator.docx
+++ b/Day26-Evaluator.docx
@@ -1959,6 +1959,7 @@
           <w:rFonts w:ascii="Consolas" w:hAnsi="Consolas"/>
           <w:sz w:val="19"/>
         </w:rPr>
+        <w:lastRenderedPageBreak/>
         <w:t xml:space="preserve">    {</w:t>
       </w:r>
     </w:p>
@@ -2625,39 +2626,216 @@
           <w:rFonts w:ascii="Consolas" w:hAnsi="Consolas"/>
           <w:sz w:val="19"/>
         </w:rPr>
-        <w:t xml:space="preserve">            // Deserialize the results</w:t>
-      </w:r>
-    </w:p>
-    <w:p>
-      <w:pPr>
-        <w:pStyle w:val="NoSpacing"/>
-        <w:rPr>
-          <w:rFonts w:ascii="Consolas" w:hAnsi="Consolas"/>
-          <w:sz w:val="19"/>
-        </w:rPr>
-      </w:pPr>
-      <w:r>
-        <w:rPr>
-          <w:rFonts w:ascii="Consolas" w:hAnsi="Consolas"/>
-          <w:sz w:val="19"/>
-        </w:rPr>
-        <w:t xml:space="preserve">            return JsonSerializer.Deserialize&lt;EvaluationResult&gt;(response.Content ?? "{}")</w:t>
-      </w:r>
-    </w:p>
-    <w:p>
-      <w:pPr>
-        <w:pStyle w:val="NoSpacing"/>
-        <w:rPr>
-          <w:rFonts w:ascii="Consolas" w:hAnsi="Consolas"/>
-          <w:sz w:val="19"/>
-        </w:rPr>
-      </w:pPr>
-      <w:r>
-        <w:rPr>
-          <w:rFonts w:ascii="Consolas" w:hAnsi="Consolas"/>
-          <w:sz w:val="19"/>
-        </w:rPr>
-        <w:t xml:space="preserve">                ?? new EvaluationResult { Passed = false, Reasoning = "Failed to parse JSON" };</w:t>
+        <w:t xml:space="preserve">            // Deserialize the results. The judge can occasionally return</w:t>
+      </w:r>
+    </w:p>
+    <w:p>
+      <w:pPr>
+        <w:pStyle w:val="NoSpacing"/>
+        <w:rPr>
+          <w:rFonts w:ascii="Consolas" w:hAnsi="Consolas"/>
+          <w:sz w:val="19"/>
+        </w:rPr>
+      </w:pPr>
+      <w:r>
+        <w:rPr>
+          <w:rFonts w:ascii="Consolas" w:hAnsi="Consolas"/>
+          <w:sz w:val="19"/>
+        </w:rPr>
+        <w:t xml:space="preserve">            // malformed or truncated JSON even with ResponseMimeType set,</w:t>
+      </w:r>
+    </w:p>
+    <w:p>
+      <w:pPr>
+        <w:pStyle w:val="NoSpacing"/>
+        <w:rPr>
+          <w:rFonts w:ascii="Consolas" w:hAnsi="Consolas"/>
+          <w:sz w:val="19"/>
+        </w:rPr>
+      </w:pPr>
+      <w:r>
+        <w:rPr>
+          <w:rFonts w:ascii="Consolas" w:hAnsi="Consolas"/>
+          <w:sz w:val="19"/>
+        </w:rPr>
+        <w:t xml:space="preserve">            // so we catch the parse failure here and fail this test case</w:t>
+      </w:r>
+    </w:p>
+    <w:p>
+      <w:pPr>
+        <w:pStyle w:val="NoSpacing"/>
+        <w:rPr>
+          <w:rFonts w:ascii="Consolas" w:hAnsi="Consolas"/>
+          <w:sz w:val="19"/>
+        </w:rPr>
+      </w:pPr>
+      <w:r>
+        <w:rPr>
+          <w:rFonts w:ascii="Consolas" w:hAnsi="Consolas"/>
+          <w:sz w:val="19"/>
+        </w:rPr>
+        <w:t xml:space="preserve">            // gracefully instead of letting an unhandled exception abort</w:t>
+      </w:r>
+    </w:p>
+    <w:p>
+      <w:pPr>
+        <w:pStyle w:val="NoSpacing"/>
+        <w:rPr>
+          <w:rFonts w:ascii="Consolas" w:hAnsi="Consolas"/>
+          <w:sz w:val="19"/>
+        </w:rPr>
+      </w:pPr>
+      <w:r>
+        <w:rPr>
+          <w:rFonts w:ascii="Consolas" w:hAnsi="Consolas"/>
+          <w:sz w:val="19"/>
+        </w:rPr>
+        <w:t xml:space="preserve">            // the whole evaluation suite.</w:t>
+      </w:r>
+    </w:p>
+    <w:p>
+      <w:pPr>
+        <w:pStyle w:val="NoSpacing"/>
+        <w:rPr>
+          <w:rFonts w:ascii="Consolas" w:hAnsi="Consolas"/>
+          <w:sz w:val="19"/>
+        </w:rPr>
+      </w:pPr>
+      <w:r>
+        <w:rPr>
+          <w:rFonts w:ascii="Consolas" w:hAnsi="Consolas"/>
+          <w:sz w:val="19"/>
+        </w:rPr>
+        <w:t xml:space="preserve">            try</w:t>
+      </w:r>
+    </w:p>
+    <w:p>
+      <w:pPr>
+        <w:pStyle w:val="NoSpacing"/>
+        <w:rPr>
+          <w:rFonts w:ascii="Consolas" w:hAnsi="Consolas"/>
+          <w:sz w:val="19"/>
+        </w:rPr>
+      </w:pPr>
+      <w:r>
+        <w:rPr>
+          <w:rFonts w:ascii="Consolas" w:hAnsi="Consolas"/>
+          <w:sz w:val="19"/>
+        </w:rPr>
+        <w:t xml:space="preserve">            {</w:t>
+      </w:r>
+    </w:p>
+    <w:p>
+      <w:pPr>
+        <w:pStyle w:val="NoSpacing"/>
+        <w:rPr>
+          <w:rFonts w:ascii="Consolas" w:hAnsi="Consolas"/>
+          <w:sz w:val="19"/>
+        </w:rPr>
+      </w:pPr>
+      <w:r>
+        <w:rPr>
+          <w:rFonts w:ascii="Consolas" w:hAnsi="Consolas"/>
+          <w:sz w:val="19"/>
+        </w:rPr>
+        <w:t xml:space="preserve">                return JsonSerializer.Deserialize&lt;EvaluationResult&gt;(response.Content ?? "{}")</w:t>
+      </w:r>
+    </w:p>
+    <w:p>
+      <w:pPr>
+        <w:pStyle w:val="NoSpacing"/>
+        <w:rPr>
+          <w:rFonts w:ascii="Consolas" w:hAnsi="Consolas"/>
+          <w:sz w:val="19"/>
+        </w:rPr>
+      </w:pPr>
+      <w:r>
+        <w:rPr>
+          <w:rFonts w:ascii="Consolas" w:hAnsi="Consolas"/>
+          <w:sz w:val="19"/>
+        </w:rPr>
+        <w:lastRenderedPageBreak/>
+        <w:t xml:space="preserve">                    ?? new EvaluationResult { Passed = false, Reasoning = "Failed to parse JSON" };</w:t>
+      </w:r>
+    </w:p>
+    <w:p>
+      <w:pPr>
+        <w:pStyle w:val="NoSpacing"/>
+        <w:rPr>
+          <w:rFonts w:ascii="Consolas" w:hAnsi="Consolas"/>
+          <w:sz w:val="19"/>
+        </w:rPr>
+      </w:pPr>
+      <w:r>
+        <w:rPr>
+          <w:rFonts w:ascii="Consolas" w:hAnsi="Consolas"/>
+          <w:sz w:val="19"/>
+        </w:rPr>
+        <w:t xml:space="preserve">            }</w:t>
+      </w:r>
+    </w:p>
+    <w:p>
+      <w:pPr>
+        <w:pStyle w:val="NoSpacing"/>
+        <w:rPr>
+          <w:rFonts w:ascii="Consolas" w:hAnsi="Consolas"/>
+          <w:sz w:val="19"/>
+        </w:rPr>
+      </w:pPr>
+      <w:r>
+        <w:rPr>
+          <w:rFonts w:ascii="Consolas" w:hAnsi="Consolas"/>
+          <w:sz w:val="19"/>
+        </w:rPr>
+        <w:t xml:space="preserve">            catch (JsonException)</w:t>
+      </w:r>
+    </w:p>
+    <w:p>
+      <w:pPr>
+        <w:pStyle w:val="NoSpacing"/>
+        <w:rPr>
+          <w:rFonts w:ascii="Consolas" w:hAnsi="Consolas"/>
+          <w:sz w:val="19"/>
+        </w:rPr>
+      </w:pPr>
+      <w:r>
+        <w:rPr>
+          <w:rFonts w:ascii="Consolas" w:hAnsi="Consolas"/>
+          <w:sz w:val="19"/>
+        </w:rPr>
+        <w:t xml:space="preserve">            {</w:t>
+      </w:r>
+    </w:p>
+    <w:p>
+      <w:pPr>
+        <w:pStyle w:val="NoSpacing"/>
+        <w:rPr>
+          <w:rFonts w:ascii="Consolas" w:hAnsi="Consolas"/>
+          <w:sz w:val="19"/>
+        </w:rPr>
+      </w:pPr>
+      <w:r>
+        <w:rPr>
+          <w:rFonts w:ascii="Consolas" w:hAnsi="Consolas"/>
+          <w:sz w:val="19"/>
+        </w:rPr>
+        <w:t xml:space="preserve">                return new EvaluationResult { Passed = false, Reasoning = "Failed to parse JSON" };</w:t>
+      </w:r>
+    </w:p>
+    <w:p>
+      <w:pPr>
+        <w:pStyle w:val="NoSpacing"/>
+        <w:rPr>
+          <w:rFonts w:ascii="Consolas" w:hAnsi="Consolas"/>
+          <w:sz w:val="19"/>
+        </w:rPr>
+      </w:pPr>
+      <w:r>
+        <w:rPr>
+          <w:rFonts w:ascii="Consolas" w:hAnsi="Consolas"/>
+          <w:sz w:val="19"/>
+        </w:rPr>
+        <w:t xml:space="preserve">            }</w:t>
       </w:r>
     </w:p>
     <w:p>
@@ -2785,7 +2963,22 @@
         <w:t>Step 6: Defending against a judge that misbehaves.</w:t>
       </w:r>
       <w:r>
-        <w:t xml:space="preserve"> Even with JSON mode enabled, an LLM can occasionally return malformed or unexpected JSON. `EvaluateAsync` guards against that with `?? new EvaluationResult { Passed = false, Reasoning = "Failed to parse JSON" }` — if deserialization returns `null`, the suite doesn't crash; it fails that test case safely and tells you why, which is exactly the behavior you'd want from a real CI-style evaluation gate.</w:t>
+        <w:t xml:space="preserve"> Even with JSON mode enabled, </w:t>
+      </w:r>
+      <w:r>
+        <w:t>an LLM can occasionally return malformed, truncated, or unexpected JSON.</w:t>
+      </w:r>
+      <w:r>
+        <w:t xml:space="preserve"> </w:t>
+      </w:r>
+      <w:r>
+        <w:t>`EvaluateAsync` guards against that on two fronts: a `?? new EvaluationResult { Passed = false, Reasoning = "Failed to parse JSON" }` fallback</w:t>
+      </w:r>
+      <w:r>
+        <w:t xml:space="preserve"> for the case where deserialization succeeds but returns `null`, and a `try`/`catch (JsonException)` around the call for the case where the response text isn't valid JSON at all and would otherwise throw. Either way, the suite doesn't crash;</w:t>
+      </w:r>
+      <w:r>
+        <w:t xml:space="preserve"> it fails that test case safely and tells you why, which is exactly the behavior you'd want from a real CI-style evaluation gate.</w:t>
       </w:r>
     </w:p>
     <w:p/>

</xml_diff>